<commit_message>
Version con la parte B
</commit_message>
<xml_diff>
--- a/TP04/Informe_TP4_Grupo3.docx
+++ b/TP04/Informe_TP4_Grupo3.docx
@@ -348,7 +348,6 @@
           <w:lang w:val="pt-BR"/>
         </w:rPr>
       </w:pPr>
-      <w:proofErr w:type="spellStart"/>
       <w:r>
         <w:rPr>
           <w:smallCaps/>
@@ -356,17 +355,7 @@
           <w:szCs w:val="28"/>
           <w:lang w:val="pt-BR"/>
         </w:rPr>
-        <w:t>Kostzer</w:t>
-      </w:r>
-      <w:proofErr w:type="spellEnd"/>
-      <w:r>
-        <w:rPr>
-          <w:smallCaps/>
-          <w:sz w:val="28"/>
-          <w:szCs w:val="28"/>
-          <w:lang w:val="pt-BR"/>
-        </w:rPr>
-        <w:t xml:space="preserve"> </w:t>
+        <w:t xml:space="preserve">Kostzer </w:t>
       </w:r>
       <w:r>
         <w:rPr>
@@ -586,57 +575,7 @@
           <w:lang w:val="es-US"/>
         </w:rPr>
         <w:lastRenderedPageBreak/>
-        <w:t xml:space="preserve">Modelo de </w:t>
-      </w:r>
-      <w:r>
-        <w:rPr>
-          <w:rFonts w:ascii="Century Schoolbook" w:eastAsia="Century Schoolbook" w:hAnsi="Century Schoolbook" w:cs="Century Schoolbook"/>
-          <w:i/>
-          <w:iCs/>
-          <w:color w:val="366091"/>
-          <w:lang w:val="es-US"/>
-        </w:rPr>
-        <w:t>Regresión</w:t>
-      </w:r>
-      <w:r>
-        <w:rPr>
-          <w:rFonts w:ascii="Century Schoolbook" w:eastAsia="Century Schoolbook" w:hAnsi="Century Schoolbook" w:cs="Century Schoolbook"/>
-          <w:i/>
-          <w:iCs/>
-          <w:color w:val="366091"/>
-          <w:lang w:val="es-US"/>
-        </w:rPr>
-        <w:t xml:space="preserve"> </w:t>
-      </w:r>
-      <w:r>
-        <w:rPr>
-          <w:rFonts w:ascii="Century Schoolbook" w:eastAsia="Century Schoolbook" w:hAnsi="Century Schoolbook" w:cs="Century Schoolbook"/>
-          <w:i/>
-          <w:iCs/>
-          <w:color w:val="366091"/>
-          <w:lang w:val="es-US"/>
-        </w:rPr>
-        <w:t>logística</w:t>
-      </w:r>
-      <w:r>
-        <w:rPr>
-          <w:rFonts w:ascii="Century Schoolbook" w:eastAsia="Century Schoolbook" w:hAnsi="Century Schoolbook" w:cs="Century Schoolbook"/>
-          <w:i/>
-          <w:iCs/>
-          <w:color w:val="366091"/>
-          <w:lang w:val="es-US"/>
-        </w:rPr>
-        <w:t xml:space="preserve"> con Regularización: Ridge y LASSO</w:t>
-      </w:r>
-      <w:r>
-        <w:rPr>
-          <w:rFonts w:ascii="Century Schoolbook" w:eastAsia="Century Schoolbook" w:hAnsi="Century Schoolbook" w:cs="Century Schoolbook"/>
-          <w:i/>
-          <w:iCs/>
-          <w:color w:val="366091"/>
-          <w:lang w:val="es-US"/>
-        </w:rPr>
-        <w:t>.</w:t>
+        <w:t>Modelo de Regresión logística con Regularización: Ridge y LASSO.</w:t>
       </w:r>
       <w:r>
         <w:rPr>
@@ -898,6 +837,7 @@
       <w:r>
         <w:rPr>
           <w:rFonts w:ascii="Times New Roman" w:eastAsia="Courier New" w:hAnsi="Times New Roman" w:cs="Times New Roman"/>
+          <w:noProof/>
           <w:sz w:val="24"/>
           <w:szCs w:val="24"/>
           <w:lang w:val="es-US"/>
@@ -1048,6 +988,7 @@
       <w:r>
         <w:rPr>
           <w:rFonts w:ascii="Times New Roman" w:eastAsia="Courier New" w:hAnsi="Times New Roman" w:cs="Times New Roman"/>
+          <w:noProof/>
           <w:sz w:val="24"/>
           <w:szCs w:val="24"/>
           <w:lang w:val="es-US"/>
@@ -1204,18 +1145,7 @@
           <w:szCs w:val="26"/>
           <w:lang w:val="es-US"/>
         </w:rPr>
-        <w:t>Penalidad óptima por Cross-validation y visualización</w:t>
-      </w:r>
-      <w:r>
-        <w:rPr>
-          <w:rFonts w:ascii="Times New Roman" w:eastAsia="Century Schoolbook" w:hAnsi="Times New Roman" w:cs="Times New Roman"/>
-          <w:b/>
-          <w:bCs/>
-          <w:sz w:val="26"/>
-          <w:szCs w:val="26"/>
-          <w:lang w:val="es-US"/>
-        </w:rPr>
-        <w:t>.</w:t>
+        <w:t>Penalidad óptima por Cross-validation y visualización.</w:t>
       </w:r>
     </w:p>
     <w:p>
@@ -1488,7 +1418,25 @@
           <w:sz w:val="24"/>
           <w:szCs w:val="24"/>
         </w:rPr>
-        <w:t>, evidencia la capacidad de LASSO para realizar selección de variables. Para λ pequeños, la mayoría de variables se conserva; a medida que λ aumenta, el modelo elimina progresivamente las variables menos relevantes, y con λ muy grandes casi todos los coeficientes se fuerzan a cero.</w:t>
+        <w:t xml:space="preserve">, evidencia la capacidad de LASSO para realizar selección de variables. Para λ pequeños, la mayoría de </w:t>
+      </w:r>
+      <w:proofErr w:type="gramStart"/>
+      <w:r>
+        <w:rPr>
+          <w:rFonts w:ascii="Times New Roman" w:eastAsia="Courier New" w:hAnsi="Times New Roman" w:cs="Times New Roman"/>
+          <w:sz w:val="24"/>
+          <w:szCs w:val="24"/>
+        </w:rPr>
+        <w:t>variables</w:t>
+      </w:r>
+      <w:proofErr w:type="gramEnd"/>
+      <w:r>
+        <w:rPr>
+          <w:rFonts w:ascii="Times New Roman" w:eastAsia="Courier New" w:hAnsi="Times New Roman" w:cs="Times New Roman"/>
+          <w:sz w:val="24"/>
+          <w:szCs w:val="24"/>
+        </w:rPr>
+        <w:t xml:space="preserve"> se conserva; a medida que λ aumenta, el modelo elimina progresivamente las variables menos relevantes, y con λ muy grandes casi todos los coeficientes se fuerzan a cero.</w:t>
       </w:r>
     </w:p>
     <w:p>
@@ -3833,6 +3781,521 @@
         <w:t>En definitiva, la regularización L1 permite simplificar el modelo mediante la eliminación de variables de menor relevancia, mientras que L2 actúa reduciendo la magnitud de los coeficientes sin descartar ninguna característica. En ambos casos, los coeficientes regularizados permanecen próximos a los obtenidos por el modelo sin penalización, lo que asegura la preservación de la información relevante y un equilibrio adecuado entre complejidad del modelo y capacidad predictiva.</w:t>
       </w:r>
     </w:p>
+    <w:p>
+      <w:pPr>
+        <w:spacing w:before="240"/>
+        <w:ind w:right="16"/>
+        <w:jc w:val="both"/>
+        <w:rPr>
+          <w:rFonts w:ascii="Times New Roman" w:eastAsia="Courier New" w:hAnsi="Times New Roman" w:cs="Times New Roman"/>
+          <w:sz w:val="24"/>
+          <w:szCs w:val="24"/>
+        </w:rPr>
+      </w:pPr>
+    </w:p>
+    <w:p>
+      <w:pPr>
+        <w:pStyle w:val="Prrafodelista"/>
+        <w:numPr>
+          <w:ilvl w:val="0"/>
+          <w:numId w:val="7"/>
+        </w:numPr>
+        <w:spacing w:before="240"/>
+        <w:ind w:right="16"/>
+        <w:rPr>
+          <w:rFonts w:ascii="Times New Roman" w:eastAsia="Courier New" w:hAnsi="Times New Roman" w:cs="Times New Roman"/>
+          <w:sz w:val="24"/>
+          <w:szCs w:val="24"/>
+          <w:lang w:val="es-US"/>
+        </w:rPr>
+      </w:pPr>
+      <w:r>
+        <w:rPr>
+          <w:rFonts w:ascii="Century Schoolbook" w:eastAsia="Century Schoolbook" w:hAnsi="Century Schoolbook" w:cs="Century Schoolbook"/>
+          <w:i/>
+          <w:iCs/>
+          <w:color w:val="366091"/>
+        </w:rPr>
+        <w:lastRenderedPageBreak/>
+        <w:t>Árboles de Decisión</w:t>
+      </w:r>
+      <w:r>
+        <w:rPr>
+          <w:rFonts w:ascii="Century Schoolbook" w:eastAsia="Century Schoolbook" w:hAnsi="Century Schoolbook" w:cs="Century Schoolbook"/>
+          <w:i/>
+          <w:iCs/>
+          <w:color w:val="366091"/>
+          <w:lang w:val="es-US"/>
+        </w:rPr>
+        <w:br/>
+      </w:r>
+    </w:p>
+    <w:p>
+      <w:pPr>
+        <w:spacing w:before="240"/>
+        <w:ind w:right="16"/>
+        <w:rPr>
+          <w:rFonts w:ascii="Times New Roman" w:eastAsia="Courier New" w:hAnsi="Times New Roman" w:cs="Times New Roman"/>
+          <w:sz w:val="24"/>
+          <w:szCs w:val="24"/>
+          <w:lang w:val="es-US"/>
+        </w:rPr>
+      </w:pPr>
+      <w:proofErr w:type="spellStart"/>
+      <w:r>
+        <w:rPr>
+          <w:rFonts w:ascii="Times New Roman" w:eastAsia="Courier New" w:hAnsi="Times New Roman" w:cs="Times New Roman"/>
+          <w:sz w:val="24"/>
+          <w:szCs w:val="24"/>
+          <w:lang w:val="es-US"/>
+        </w:rPr>
+        <w:t>Arbol</w:t>
+      </w:r>
+      <w:proofErr w:type="spellEnd"/>
+      <w:r>
+        <w:rPr>
+          <w:rFonts w:ascii="Times New Roman" w:eastAsia="Courier New" w:hAnsi="Times New Roman" w:cs="Times New Roman"/>
+          <w:sz w:val="24"/>
+          <w:szCs w:val="24"/>
+          <w:lang w:val="es-US"/>
+        </w:rPr>
+        <w:t xml:space="preserve"> de decisión podado</w:t>
+      </w:r>
+    </w:p>
+    <w:p>
+      <w:pPr>
+        <w:spacing w:before="240"/>
+        <w:ind w:right="16"/>
+        <w:rPr>
+          <w:rFonts w:ascii="Times New Roman" w:eastAsia="Courier New" w:hAnsi="Times New Roman" w:cs="Times New Roman"/>
+          <w:sz w:val="24"/>
+          <w:szCs w:val="24"/>
+          <w:lang w:val="es-US"/>
+        </w:rPr>
+      </w:pPr>
+      <w:r>
+        <w:rPr>
+          <w:rFonts w:ascii="Times New Roman" w:eastAsia="Courier New" w:hAnsi="Times New Roman" w:cs="Times New Roman"/>
+          <w:sz w:val="24"/>
+          <w:szCs w:val="24"/>
+          <w:lang w:val="es-US"/>
+        </w:rPr>
+        <w:drawing>
+          <wp:inline distT="0" distB="0" distL="0" distR="0" wp14:anchorId="3A9F2F33" wp14:editId="47D803C7">
+            <wp:extent cx="5400040" cy="2644775"/>
+            <wp:effectExtent l="0" t="0" r="0" b="3175"/>
+            <wp:docPr id="1719639729" name="Imagen 1"/>
+            <wp:cNvGraphicFramePr>
+              <a:graphicFrameLocks xmlns:a="http://schemas.openxmlformats.org/drawingml/2006/main" noChangeAspect="1"/>
+            </wp:cNvGraphicFramePr>
+            <a:graphic xmlns:a="http://schemas.openxmlformats.org/drawingml/2006/main">
+              <a:graphicData uri="http://schemas.openxmlformats.org/drawingml/2006/picture">
+                <pic:pic xmlns:pic="http://schemas.openxmlformats.org/drawingml/2006/picture">
+                  <pic:nvPicPr>
+                    <pic:cNvPr id="1719639729" name=""/>
+                    <pic:cNvPicPr/>
+                  </pic:nvPicPr>
+                  <pic:blipFill>
+                    <a:blip r:embed="rId10"/>
+                    <a:stretch>
+                      <a:fillRect/>
+                    </a:stretch>
+                  </pic:blipFill>
+                  <pic:spPr>
+                    <a:xfrm>
+                      <a:off x="0" y="0"/>
+                      <a:ext cx="5400040" cy="2644775"/>
+                    </a:xfrm>
+                    <a:prstGeom prst="rect">
+                      <a:avLst/>
+                    </a:prstGeom>
+                  </pic:spPr>
+                </pic:pic>
+              </a:graphicData>
+            </a:graphic>
+          </wp:inline>
+        </w:drawing>
+      </w:r>
+    </w:p>
+    <w:p>
+      <w:pPr>
+        <w:spacing w:before="240"/>
+        <w:ind w:right="16" w:firstLine="708"/>
+        <w:rPr>
+          <w:rFonts w:ascii="Times New Roman" w:eastAsia="Courier New" w:hAnsi="Times New Roman" w:cs="Times New Roman"/>
+          <w:sz w:val="24"/>
+          <w:szCs w:val="24"/>
+          <w:lang w:val="es-US"/>
+        </w:rPr>
+      </w:pPr>
+      <w:r>
+        <w:rPr>
+          <w:rFonts w:ascii="Times New Roman" w:eastAsia="Courier New" w:hAnsi="Times New Roman" w:cs="Times New Roman"/>
+          <w:sz w:val="24"/>
+          <w:szCs w:val="24"/>
+          <w:lang w:val="es-US"/>
+        </w:rPr>
+        <w:t xml:space="preserve">La figura muestra que, con </w:t>
+      </w:r>
+      <w:proofErr w:type="spellStart"/>
+      <w:r>
+        <w:rPr>
+          <w:rFonts w:ascii="Times New Roman" w:eastAsia="Courier New" w:hAnsi="Times New Roman" w:cs="Times New Roman"/>
+          <w:sz w:val="24"/>
+          <w:szCs w:val="24"/>
+          <w:lang w:val="es-US"/>
+        </w:rPr>
+        <w:t>ccp_alpha</w:t>
+      </w:r>
+      <w:proofErr w:type="spellEnd"/>
+      <w:r>
+        <w:rPr>
+          <w:rFonts w:ascii="Times New Roman" w:eastAsia="Courier New" w:hAnsi="Times New Roman" w:cs="Times New Roman"/>
+          <w:sz w:val="24"/>
+          <w:szCs w:val="24"/>
+          <w:lang w:val="es-US"/>
+        </w:rPr>
+        <w:t xml:space="preserve"> muy pequeño, el árbol casi no se poda y el error de clasificación se mantiene alto </w:t>
+      </w:r>
+      <w:r>
+        <w:rPr>
+          <w:rFonts w:ascii="Times New Roman" w:eastAsia="Courier New" w:hAnsi="Times New Roman" w:cs="Times New Roman"/>
+          <w:sz w:val="24"/>
+          <w:szCs w:val="24"/>
+          <w:lang w:val="es-US"/>
+        </w:rPr>
+        <w:t xml:space="preserve">(levemente por encima de </w:t>
+      </w:r>
+      <w:r>
+        <w:rPr>
+          <w:rFonts w:ascii="Times New Roman" w:eastAsia="Courier New" w:hAnsi="Times New Roman" w:cs="Times New Roman"/>
+          <w:sz w:val="24"/>
+          <w:szCs w:val="24"/>
+          <w:lang w:val="es-US"/>
+        </w:rPr>
+        <w:t xml:space="preserve">0,39). Al aumentar </w:t>
+      </w:r>
+      <w:proofErr w:type="spellStart"/>
+      <w:r>
+        <w:rPr>
+          <w:rFonts w:ascii="Times New Roman" w:eastAsia="Courier New" w:hAnsi="Times New Roman" w:cs="Times New Roman"/>
+          <w:sz w:val="24"/>
+          <w:szCs w:val="24"/>
+          <w:lang w:val="es-US"/>
+        </w:rPr>
+        <w:t>ccp_alpha</w:t>
+      </w:r>
+      <w:proofErr w:type="spellEnd"/>
+      <w:r>
+        <w:rPr>
+          <w:rFonts w:ascii="Times New Roman" w:eastAsia="Courier New" w:hAnsi="Times New Roman" w:cs="Times New Roman"/>
+          <w:sz w:val="24"/>
+          <w:szCs w:val="24"/>
+          <w:lang w:val="es-US"/>
+        </w:rPr>
+        <w:t xml:space="preserve"> el error baja hasta un mínimo cercano a 0,34 alrededor de </w:t>
+      </w:r>
+      <w:proofErr w:type="spellStart"/>
+      <w:r>
+        <w:rPr>
+          <w:rFonts w:ascii="Times New Roman" w:eastAsia="Courier New" w:hAnsi="Times New Roman" w:cs="Times New Roman"/>
+          <w:sz w:val="24"/>
+          <w:szCs w:val="24"/>
+          <w:lang w:val="es-US"/>
+        </w:rPr>
+        <w:t>ccp_alpha</w:t>
+      </w:r>
+      <w:proofErr w:type="spellEnd"/>
+      <w:r>
+        <w:rPr>
+          <w:rFonts w:ascii="Times New Roman" w:eastAsia="Courier New" w:hAnsi="Times New Roman" w:cs="Times New Roman"/>
+          <w:sz w:val="24"/>
+          <w:szCs w:val="24"/>
+          <w:lang w:val="es-US"/>
+        </w:rPr>
+        <w:t xml:space="preserve"> ≈ 1,3×10⁻⁴, que es el valor que elegimos como óptimo. A partir de ahí, si seguimos aumentando </w:t>
+      </w:r>
+      <w:proofErr w:type="spellStart"/>
+      <w:r>
+        <w:rPr>
+          <w:rFonts w:ascii="Times New Roman" w:eastAsia="Courier New" w:hAnsi="Times New Roman" w:cs="Times New Roman"/>
+          <w:sz w:val="24"/>
+          <w:szCs w:val="24"/>
+          <w:lang w:val="es-US"/>
+        </w:rPr>
+        <w:t>ccp_alpha</w:t>
+      </w:r>
+      <w:proofErr w:type="spellEnd"/>
+      <w:r>
+        <w:rPr>
+          <w:rFonts w:ascii="Times New Roman" w:eastAsia="Courier New" w:hAnsi="Times New Roman" w:cs="Times New Roman"/>
+          <w:sz w:val="24"/>
+          <w:szCs w:val="24"/>
+          <w:lang w:val="es-US"/>
+        </w:rPr>
+        <w:t>, el error vuelve a crecer porque el árbol se vuelve excesivamente simple.</w:t>
+      </w:r>
+    </w:p>
+    <w:p>
+      <w:pPr>
+        <w:spacing w:before="240"/>
+        <w:ind w:right="16"/>
+        <w:rPr>
+          <w:rFonts w:ascii="Times New Roman" w:eastAsia="Courier New" w:hAnsi="Times New Roman" w:cs="Times New Roman"/>
+          <w:sz w:val="24"/>
+          <w:szCs w:val="24"/>
+          <w:lang w:val="es-US"/>
+        </w:rPr>
+      </w:pPr>
+    </w:p>
+    <w:p>
+      <w:pPr>
+        <w:spacing w:before="240"/>
+        <w:ind w:right="16"/>
+        <w:rPr>
+          <w:rFonts w:ascii="Times New Roman" w:eastAsia="Courier New" w:hAnsi="Times New Roman" w:cs="Times New Roman"/>
+          <w:sz w:val="24"/>
+          <w:szCs w:val="24"/>
+          <w:lang w:val="es-US"/>
+        </w:rPr>
+      </w:pPr>
+      <w:r>
+        <w:rPr>
+          <w:rFonts w:ascii="Times New Roman" w:eastAsia="Courier New" w:hAnsi="Times New Roman" w:cs="Times New Roman"/>
+          <w:sz w:val="24"/>
+          <w:szCs w:val="24"/>
+          <w:lang w:val="es-US"/>
+        </w:rPr>
+        <w:t xml:space="preserve">Visualización del árbol podado por </w:t>
+      </w:r>
+      <w:proofErr w:type="spellStart"/>
+      <w:r>
+        <w:rPr>
+          <w:rFonts w:ascii="Times New Roman" w:eastAsia="Courier New" w:hAnsi="Times New Roman" w:cs="Times New Roman"/>
+          <w:sz w:val="24"/>
+          <w:szCs w:val="24"/>
+          <w:lang w:val="es-US"/>
+        </w:rPr>
+        <w:t>cross-validation</w:t>
+      </w:r>
+      <w:proofErr w:type="spellEnd"/>
+      <w:r>
+        <w:rPr>
+          <w:rFonts w:ascii="Times New Roman" w:eastAsia="Courier New" w:hAnsi="Times New Roman" w:cs="Times New Roman"/>
+          <w:sz w:val="24"/>
+          <w:szCs w:val="24"/>
+          <w:lang w:val="es-US"/>
+        </w:rPr>
+        <w:t xml:space="preserve"> </w:t>
+      </w:r>
+    </w:p>
+    <w:p>
+      <w:pPr>
+        <w:spacing w:before="240"/>
+        <w:ind w:right="16"/>
+        <w:rPr>
+          <w:rFonts w:eastAsia="Courier New"/>
+        </w:rPr>
+      </w:pPr>
+      <w:r>
+        <w:rPr>
+          <w:rFonts w:ascii="Times New Roman" w:eastAsia="Courier New" w:hAnsi="Times New Roman" w:cs="Times New Roman"/>
+          <w:sz w:val="24"/>
+          <w:szCs w:val="24"/>
+          <w:lang w:val="es-US"/>
+        </w:rPr>
+        <w:tab/>
+      </w:r>
+      <w:r>
+        <w:rPr>
+          <w:rFonts w:eastAsia="Courier New"/>
+        </w:rPr>
+        <w:t>En la siguiente figura mostraremos</w:t>
+      </w:r>
+      <w:r>
+        <w:rPr>
+          <w:rFonts w:eastAsia="Courier New"/>
+        </w:rPr>
+        <w:t xml:space="preserve"> los niveles superiores del árbol CART podado con el </w:t>
+      </w:r>
+      <w:proofErr w:type="spellStart"/>
+      <w:r>
+        <w:rPr>
+          <w:rFonts w:eastAsia="Courier New"/>
+        </w:rPr>
+        <w:t>ccp_alpha</w:t>
+      </w:r>
+      <w:proofErr w:type="spellEnd"/>
+      <w:r>
+        <w:rPr>
+          <w:rFonts w:eastAsia="Courier New"/>
+        </w:rPr>
+        <w:t xml:space="preserve"> óptimo. La raíz del árbol separa a los hogares según el nivel educativo (nivel_ed_6), lo que indica que la educación es la primera variable que utiliza el modelo para discriminar entre pobres y no pobres. En las ramas siguientes aparecen particiones por la situación</w:t>
+      </w:r>
+      <w:r>
+        <w:rPr>
+          <w:rFonts w:eastAsia="Courier New"/>
+          <w:b/>
+          <w:bCs/>
+        </w:rPr>
+        <w:t xml:space="preserve"> </w:t>
+      </w:r>
+      <w:r>
+        <w:rPr>
+          <w:rFonts w:eastAsia="Courier New"/>
+        </w:rPr>
+        <w:t>laboral (estado) y por características demográficas del hogar (ch06, ch03, etc.), generando grupos con distinta proporción de pobreza. En general, las ramas de la izquierda concentran hogares con mayor probabilidad de ser pobres, mientras que las de la derecha agrupan hogares predominantemente no pobres.</w:t>
+      </w:r>
+    </w:p>
+    <w:p>
+      <w:pPr>
+        <w:spacing w:before="240"/>
+        <w:ind w:right="16"/>
+        <w:rPr>
+          <w:rFonts w:ascii="Times New Roman" w:eastAsia="Courier New" w:hAnsi="Times New Roman" w:cs="Times New Roman"/>
+          <w:sz w:val="24"/>
+          <w:szCs w:val="24"/>
+          <w:lang w:val="es-US"/>
+        </w:rPr>
+      </w:pPr>
+      <w:r>
+        <w:rPr>
+          <w:rFonts w:ascii="Times New Roman" w:eastAsia="Courier New" w:hAnsi="Times New Roman" w:cs="Times New Roman"/>
+          <w:sz w:val="24"/>
+          <w:szCs w:val="24"/>
+          <w:lang w:val="es-US"/>
+        </w:rPr>
+        <w:tab/>
+        <w:t>Además, mostraremos una figura adicional donde mostraremos la importancia de cada una de las variables</w:t>
+      </w:r>
+      <w:r>
+        <w:rPr>
+          <w:rFonts w:ascii="Times New Roman" w:eastAsia="Courier New" w:hAnsi="Times New Roman" w:cs="Times New Roman"/>
+          <w:sz w:val="24"/>
+          <w:szCs w:val="24"/>
+          <w:lang w:val="es-US"/>
+        </w:rPr>
+        <w:t xml:space="preserve"> para observar no solo las variables mencionadas previamente sino las que el modelo no considera relevantes.</w:t>
+      </w:r>
+    </w:p>
+    <w:p>
+      <w:pPr>
+        <w:spacing w:before="240"/>
+        <w:ind w:right="16"/>
+        <w:rPr>
+          <w:rFonts w:ascii="Times New Roman" w:eastAsia="Courier New" w:hAnsi="Times New Roman" w:cs="Times New Roman"/>
+          <w:sz w:val="24"/>
+          <w:szCs w:val="24"/>
+          <w:lang w:val="es-US"/>
+        </w:rPr>
+      </w:pPr>
+      <w:r>
+        <w:rPr>
+          <w:rFonts w:ascii="Times New Roman" w:eastAsia="Courier New" w:hAnsi="Times New Roman" w:cs="Times New Roman"/>
+          <w:sz w:val="24"/>
+          <w:szCs w:val="24"/>
+          <w:lang w:val="es-US"/>
+        </w:rPr>
+        <w:lastRenderedPageBreak/>
+        <w:drawing>
+          <wp:inline distT="0" distB="0" distL="0" distR="0" wp14:anchorId="4843E603" wp14:editId="7DEF9CDD">
+            <wp:extent cx="9360535" cy="6229855"/>
+            <wp:effectExtent l="3493" t="0" r="0" b="0"/>
+            <wp:docPr id="1824398755" name="Imagen 1" descr="Diagrama"/>
+            <wp:cNvGraphicFramePr>
+              <a:graphicFrameLocks xmlns:a="http://schemas.openxmlformats.org/drawingml/2006/main" noChangeAspect="1"/>
+            </wp:cNvGraphicFramePr>
+            <a:graphic xmlns:a="http://schemas.openxmlformats.org/drawingml/2006/main">
+              <a:graphicData uri="http://schemas.openxmlformats.org/drawingml/2006/picture">
+                <pic:pic xmlns:pic="http://schemas.openxmlformats.org/drawingml/2006/picture">
+                  <pic:nvPicPr>
+                    <pic:cNvPr id="1824398755" name="Imagen 1" descr="Diagrama"/>
+                    <pic:cNvPicPr/>
+                  </pic:nvPicPr>
+                  <pic:blipFill>
+                    <a:blip r:embed="rId11"/>
+                    <a:stretch>
+                      <a:fillRect/>
+                    </a:stretch>
+                  </pic:blipFill>
+                  <pic:spPr>
+                    <a:xfrm rot="16200000">
+                      <a:off x="0" y="0"/>
+                      <a:ext cx="9391156" cy="6250235"/>
+                    </a:xfrm>
+                    <a:prstGeom prst="rect">
+                      <a:avLst/>
+                    </a:prstGeom>
+                  </pic:spPr>
+                </pic:pic>
+              </a:graphicData>
+            </a:graphic>
+          </wp:inline>
+        </w:drawing>
+      </w:r>
+    </w:p>
+    <w:p>
+      <w:pPr>
+        <w:spacing w:before="240"/>
+        <w:ind w:right="16"/>
+        <w:rPr>
+          <w:rFonts w:ascii="Times New Roman" w:eastAsia="Courier New" w:hAnsi="Times New Roman" w:cs="Times New Roman"/>
+          <w:sz w:val="24"/>
+          <w:szCs w:val="24"/>
+          <w:lang w:val="es-US"/>
+        </w:rPr>
+      </w:pPr>
+      <w:r>
+        <w:rPr>
+          <w:noProof/>
+        </w:rPr>
+        <w:lastRenderedPageBreak/>
+        <w:t xml:space="preserve"> </w:t>
+      </w:r>
+      <w:r>
+        <w:rPr>
+          <w:rFonts w:ascii="Times New Roman" w:eastAsia="Courier New" w:hAnsi="Times New Roman" w:cs="Times New Roman"/>
+          <w:sz w:val="24"/>
+          <w:szCs w:val="24"/>
+          <w:lang w:val="es-US"/>
+        </w:rPr>
+        <w:drawing>
+          <wp:inline distT="0" distB="0" distL="0" distR="0" wp14:anchorId="4087B994" wp14:editId="2BC1DDD8">
+            <wp:extent cx="5400040" cy="3208020"/>
+            <wp:effectExtent l="0" t="0" r="0" b="0"/>
+            <wp:docPr id="773747224" name="Imagen 1" descr="Aplicación&#10;&#10;El contenido generado por IA puede ser incorrecto."/>
+            <wp:cNvGraphicFramePr>
+              <a:graphicFrameLocks xmlns:a="http://schemas.openxmlformats.org/drawingml/2006/main" noChangeAspect="1"/>
+            </wp:cNvGraphicFramePr>
+            <a:graphic xmlns:a="http://schemas.openxmlformats.org/drawingml/2006/main">
+              <a:graphicData uri="http://schemas.openxmlformats.org/drawingml/2006/picture">
+                <pic:pic xmlns:pic="http://schemas.openxmlformats.org/drawingml/2006/picture">
+                  <pic:nvPicPr>
+                    <pic:cNvPr id="773747224" name="Imagen 1" descr="Aplicación&#10;&#10;El contenido generado por IA puede ser incorrecto."/>
+                    <pic:cNvPicPr/>
+                  </pic:nvPicPr>
+                  <pic:blipFill>
+                    <a:blip r:embed="rId12"/>
+                    <a:stretch>
+                      <a:fillRect/>
+                    </a:stretch>
+                  </pic:blipFill>
+                  <pic:spPr>
+                    <a:xfrm>
+                      <a:off x="0" y="0"/>
+                      <a:ext cx="5400040" cy="3208020"/>
+                    </a:xfrm>
+                    <a:prstGeom prst="rect">
+                      <a:avLst/>
+                    </a:prstGeom>
+                  </pic:spPr>
+                </pic:pic>
+              </a:graphicData>
+            </a:graphic>
+          </wp:inline>
+        </w:drawing>
+      </w:r>
+    </w:p>
     <w:sectPr>
       <w:pgSz w:w="11906" w:h="16838"/>
       <w:pgMar w:top="1417" w:right="1701" w:bottom="1417" w:left="1701" w:header="708" w:footer="708" w:gutter="0"/>
@@ -4108,6 +4571,146 @@
     </w:lvl>
   </w:abstractNum>
   <w:abstractNum w:abstractNumId="2" w15:restartNumberingAfterBreak="0">
+    <w:nsid w:val="18AD63FD"/>
+    <w:multiLevelType w:val="multilevel"/>
+    <w:tmpl w:val="45E48FB4"/>
+    <w:lvl w:ilvl="0">
+      <w:start w:val="1"/>
+      <w:numFmt w:val="decimal"/>
+      <w:lvlText w:val="%1."/>
+      <w:lvlJc w:val="left"/>
+      <w:pPr>
+        <w:ind w:left="720" w:hanging="360"/>
+      </w:pPr>
+      <w:rPr>
+        <w:strike w:val="0"/>
+        <w:dstrike w:val="0"/>
+        <w:u w:val="none"/>
+        <w:effect w:val="none"/>
+      </w:rPr>
+    </w:lvl>
+    <w:lvl w:ilvl="1">
+      <w:start w:val="1"/>
+      <w:numFmt w:val="lowerLetter"/>
+      <w:lvlText w:val="%2."/>
+      <w:lvlJc w:val="left"/>
+      <w:pPr>
+        <w:ind w:left="720" w:hanging="360"/>
+      </w:pPr>
+      <w:rPr>
+        <w:strike w:val="0"/>
+        <w:dstrike w:val="0"/>
+        <w:u w:val="none"/>
+        <w:effect w:val="none"/>
+      </w:rPr>
+    </w:lvl>
+    <w:lvl w:ilvl="2">
+      <w:start w:val="1"/>
+      <w:numFmt w:val="lowerRoman"/>
+      <w:lvlText w:val="%3."/>
+      <w:lvlJc w:val="right"/>
+      <w:pPr>
+        <w:ind w:left="2160" w:hanging="180"/>
+      </w:pPr>
+      <w:rPr>
+        <w:strike w:val="0"/>
+        <w:dstrike w:val="0"/>
+        <w:u w:val="none"/>
+        <w:effect w:val="none"/>
+      </w:rPr>
+    </w:lvl>
+    <w:lvl w:ilvl="3">
+      <w:start w:val="1"/>
+      <w:numFmt w:val="decimal"/>
+      <w:lvlText w:val="%4."/>
+      <w:lvlJc w:val="left"/>
+      <w:pPr>
+        <w:ind w:left="2880" w:hanging="360"/>
+      </w:pPr>
+      <w:rPr>
+        <w:strike w:val="0"/>
+        <w:dstrike w:val="0"/>
+        <w:u w:val="none"/>
+        <w:effect w:val="none"/>
+      </w:rPr>
+    </w:lvl>
+    <w:lvl w:ilvl="4">
+      <w:start w:val="1"/>
+      <w:numFmt w:val="lowerLetter"/>
+      <w:lvlText w:val="%5."/>
+      <w:lvlJc w:val="left"/>
+      <w:pPr>
+        <w:ind w:left="3600" w:hanging="360"/>
+      </w:pPr>
+      <w:rPr>
+        <w:strike w:val="0"/>
+        <w:dstrike w:val="0"/>
+        <w:u w:val="none"/>
+        <w:effect w:val="none"/>
+      </w:rPr>
+    </w:lvl>
+    <w:lvl w:ilvl="5">
+      <w:start w:val="1"/>
+      <w:numFmt w:val="lowerRoman"/>
+      <w:lvlText w:val="%6."/>
+      <w:lvlJc w:val="right"/>
+      <w:pPr>
+        <w:ind w:left="4320" w:hanging="180"/>
+      </w:pPr>
+      <w:rPr>
+        <w:strike w:val="0"/>
+        <w:dstrike w:val="0"/>
+        <w:u w:val="none"/>
+        <w:effect w:val="none"/>
+      </w:rPr>
+    </w:lvl>
+    <w:lvl w:ilvl="6">
+      <w:start w:val="1"/>
+      <w:numFmt w:val="decimal"/>
+      <w:lvlText w:val="%7."/>
+      <w:lvlJc w:val="left"/>
+      <w:pPr>
+        <w:ind w:left="5040" w:hanging="360"/>
+      </w:pPr>
+      <w:rPr>
+        <w:strike w:val="0"/>
+        <w:dstrike w:val="0"/>
+        <w:u w:val="none"/>
+        <w:effect w:val="none"/>
+      </w:rPr>
+    </w:lvl>
+    <w:lvl w:ilvl="7">
+      <w:start w:val="1"/>
+      <w:numFmt w:val="lowerLetter"/>
+      <w:lvlText w:val="%8."/>
+      <w:lvlJc w:val="left"/>
+      <w:pPr>
+        <w:ind w:left="5760" w:hanging="360"/>
+      </w:pPr>
+      <w:rPr>
+        <w:strike w:val="0"/>
+        <w:dstrike w:val="0"/>
+        <w:u w:val="none"/>
+        <w:effect w:val="none"/>
+      </w:rPr>
+    </w:lvl>
+    <w:lvl w:ilvl="8">
+      <w:start w:val="1"/>
+      <w:numFmt w:val="lowerRoman"/>
+      <w:lvlText w:val="%9."/>
+      <w:lvlJc w:val="right"/>
+      <w:pPr>
+        <w:ind w:left="6480" w:hanging="180"/>
+      </w:pPr>
+      <w:rPr>
+        <w:strike w:val="0"/>
+        <w:dstrike w:val="0"/>
+        <w:u w:val="none"/>
+        <w:effect w:val="none"/>
+      </w:rPr>
+    </w:lvl>
+  </w:abstractNum>
+  <w:abstractNum w:abstractNumId="3" w15:restartNumberingAfterBreak="0">
     <w:nsid w:val="1A0907D5"/>
     <w:multiLevelType w:val="hybridMultilevel"/>
     <w:tmpl w:val="000C27E8"/>
@@ -4196,7 +4799,7 @@
       </w:pPr>
     </w:lvl>
   </w:abstractNum>
-  <w:abstractNum w:abstractNumId="3" w15:restartNumberingAfterBreak="0">
+  <w:abstractNum w:abstractNumId="4" w15:restartNumberingAfterBreak="0">
     <w:nsid w:val="303B1314"/>
     <w:multiLevelType w:val="multilevel"/>
     <w:tmpl w:val="35463EB4"/>
@@ -4345,7 +4948,7 @@
       </w:rPr>
     </w:lvl>
   </w:abstractNum>
-  <w:abstractNum w:abstractNumId="4" w15:restartNumberingAfterBreak="0">
+  <w:abstractNum w:abstractNumId="5" w15:restartNumberingAfterBreak="0">
     <w:nsid w:val="42D51DEB"/>
     <w:multiLevelType w:val="multilevel"/>
     <w:tmpl w:val="F2B2348A"/>
@@ -4462,7 +5065,7 @@
       </w:pPr>
     </w:lvl>
   </w:abstractNum>
-  <w:abstractNum w:abstractNumId="5" w15:restartNumberingAfterBreak="0">
+  <w:abstractNum w:abstractNumId="6" w15:restartNumberingAfterBreak="0">
     <w:nsid w:val="48AD6280"/>
     <w:multiLevelType w:val="hybridMultilevel"/>
     <w:tmpl w:val="EF7E55C0"/>
@@ -4551,7 +5154,7 @@
       </w:pPr>
     </w:lvl>
   </w:abstractNum>
-  <w:abstractNum w:abstractNumId="6" w15:restartNumberingAfterBreak="0">
+  <w:abstractNum w:abstractNumId="7" w15:restartNumberingAfterBreak="0">
     <w:nsid w:val="55D21E06"/>
     <w:multiLevelType w:val="multilevel"/>
     <w:tmpl w:val="FCA053FE"/>
@@ -4700,7 +5303,7 @@
       </w:rPr>
     </w:lvl>
   </w:abstractNum>
-  <w:abstractNum w:abstractNumId="7" w15:restartNumberingAfterBreak="0">
+  <w:abstractNum w:abstractNumId="8" w15:restartNumberingAfterBreak="0">
     <w:nsid w:val="5616427D"/>
     <w:multiLevelType w:val="multilevel"/>
     <w:tmpl w:val="FAA88E9E"/>
@@ -4849,7 +5452,7 @@
       </w:rPr>
     </w:lvl>
   </w:abstractNum>
-  <w:abstractNum w:abstractNumId="8" w15:restartNumberingAfterBreak="0">
+  <w:abstractNum w:abstractNumId="9" w15:restartNumberingAfterBreak="0">
     <w:nsid w:val="57CA33A0"/>
     <w:multiLevelType w:val="multilevel"/>
     <w:tmpl w:val="5C721620"/>
@@ -4998,7 +5601,7 @@
       </w:rPr>
     </w:lvl>
   </w:abstractNum>
-  <w:abstractNum w:abstractNumId="9" w15:restartNumberingAfterBreak="0">
+  <w:abstractNum w:abstractNumId="10" w15:restartNumberingAfterBreak="0">
     <w:nsid w:val="5D997046"/>
     <w:multiLevelType w:val="multilevel"/>
     <w:tmpl w:val="FBE28FF0"/>
@@ -5147,7 +5750,7 @@
       </w:rPr>
     </w:lvl>
   </w:abstractNum>
-  <w:abstractNum w:abstractNumId="10" w15:restartNumberingAfterBreak="0">
+  <w:abstractNum w:abstractNumId="11" w15:restartNumberingAfterBreak="0">
     <w:nsid w:val="766A22D9"/>
     <w:multiLevelType w:val="hybridMultilevel"/>
     <w:tmpl w:val="5A028318"/>
@@ -5157,7 +5760,7 @@
       <w:lvlText w:val="%1."/>
       <w:lvlJc w:val="left"/>
       <w:pPr>
-        <w:ind w:left="750" w:hanging="390"/>
+        <w:ind w:left="674" w:hanging="390"/>
       </w:pPr>
       <w:rPr>
         <w:rFonts w:hint="default"/>
@@ -5237,7 +5840,7 @@
       </w:pPr>
     </w:lvl>
   </w:abstractNum>
-  <w:abstractNum w:abstractNumId="11" w15:restartNumberingAfterBreak="0">
+  <w:abstractNum w:abstractNumId="12" w15:restartNumberingAfterBreak="0">
     <w:nsid w:val="7947772F"/>
     <w:multiLevelType w:val="hybridMultilevel"/>
     <w:tmpl w:val="9C34EE3E"/>
@@ -5327,40 +5930,70 @@
     </w:lvl>
   </w:abstractNum>
   <w:num w:numId="1" w16cid:durableId="1518036038">
-    <w:abstractNumId w:val="5"/>
+    <w:abstractNumId w:val="6"/>
   </w:num>
   <w:num w:numId="2" w16cid:durableId="1772624462">
-    <w:abstractNumId w:val="9"/>
+    <w:abstractNumId w:val="10"/>
   </w:num>
   <w:num w:numId="3" w16cid:durableId="271983750">
     <w:abstractNumId w:val="0"/>
   </w:num>
   <w:num w:numId="4" w16cid:durableId="458883850">
-    <w:abstractNumId w:val="7"/>
+    <w:abstractNumId w:val="8"/>
   </w:num>
   <w:num w:numId="5" w16cid:durableId="968820525">
     <w:abstractNumId w:val="1"/>
   </w:num>
   <w:num w:numId="6" w16cid:durableId="986787037">
-    <w:abstractNumId w:val="6"/>
+    <w:abstractNumId w:val="7"/>
   </w:num>
   <w:num w:numId="7" w16cid:durableId="2022195482">
-    <w:abstractNumId w:val="10"/>
+    <w:abstractNumId w:val="11"/>
   </w:num>
   <w:num w:numId="8" w16cid:durableId="79060080">
-    <w:abstractNumId w:val="2"/>
+    <w:abstractNumId w:val="3"/>
   </w:num>
   <w:num w:numId="9" w16cid:durableId="1005091516">
-    <w:abstractNumId w:val="11"/>
+    <w:abstractNumId w:val="12"/>
   </w:num>
   <w:num w:numId="10" w16cid:durableId="246233948">
-    <w:abstractNumId w:val="8"/>
+    <w:abstractNumId w:val="9"/>
   </w:num>
   <w:num w:numId="11" w16cid:durableId="290478730">
+    <w:abstractNumId w:val="5"/>
+  </w:num>
+  <w:num w:numId="12" w16cid:durableId="45959140">
     <w:abstractNumId w:val="4"/>
   </w:num>
-  <w:num w:numId="12" w16cid:durableId="45959140">
-    <w:abstractNumId w:val="3"/>
+  <w:num w:numId="13" w16cid:durableId="477570743">
+    <w:abstractNumId w:val="2"/>
+    <w:lvlOverride w:ilvl="0">
+      <w:startOverride w:val="1"/>
+    </w:lvlOverride>
+    <w:lvlOverride w:ilvl="1">
+      <w:startOverride w:val="1"/>
+    </w:lvlOverride>
+    <w:lvlOverride w:ilvl="2">
+      <w:startOverride w:val="1"/>
+    </w:lvlOverride>
+    <w:lvlOverride w:ilvl="3">
+      <w:startOverride w:val="1"/>
+    </w:lvlOverride>
+    <w:lvlOverride w:ilvl="4">
+      <w:startOverride w:val="1"/>
+    </w:lvlOverride>
+    <w:lvlOverride w:ilvl="5">
+      <w:startOverride w:val="1"/>
+    </w:lvlOverride>
+    <w:lvlOverride w:ilvl="6">
+      <w:startOverride w:val="1"/>
+    </w:lvlOverride>
+    <w:lvlOverride w:ilvl="7">
+      <w:startOverride w:val="1"/>
+    </w:lvlOverride>
+    <w:lvlOverride w:ilvl="8">
+      <w:startOverride w:val="1"/>
+    </w:lvlOverride>
   </w:num>
 </w:numbering>
 </file>
@@ -6300,6 +6933,19 @@
       </w:tblBorders>
     </w:tblPr>
   </w:style>
+  <w:style w:type="paragraph" w:styleId="NormalWeb">
+    <w:name w:val="Normal (Web)"/>
+    <w:basedOn w:val="Normal"/>
+    <w:uiPriority w:val="99"/>
+    <w:semiHidden/>
+    <w:unhideWhenUsed/>
+    <w:rsid w:val="006D4A8D"/>
+    <w:rPr>
+      <w:rFonts w:ascii="Times New Roman" w:hAnsi="Times New Roman" w:cs="Times New Roman"/>
+      <w:sz w:val="24"/>
+      <w:szCs w:val="24"/>
+    </w:rPr>
+  </w:style>
 </w:styles>
 </file>
 

</xml_diff>